<commit_message>
Various changes and adding log system for failed transactions
</commit_message>
<xml_diff>
--- a/Artifacts/Cash transfer app report.docx
+++ b/Artifacts/Cash transfer app report.docx
@@ -40,10 +40,25 @@
         <w:t>PHP</w:t>
       </w:r>
       <w:r>
-        <w:t xml:space="preserve"> because it is built for server-side web development, and it integrates naturally with HTML, </w:t>
-      </w:r>
-      <w:r>
-        <w:t>this allows dynamic content generation and efficient handling of form submissions, user authentication and transaction processing. Since the project is a web based financial system, PHP is well suited for managing the server-side logic</w:t>
+        <w:t xml:space="preserve"> because it is built for server-side web development, and it integrates naturally with </w:t>
+      </w:r>
+      <w:r>
+        <w:t>HTML. This</w:t>
+      </w:r>
+      <w:r>
+        <w:t xml:space="preserve"> allows dynamic content generation and efficient handling of form submissions, user authentication and transaction processing. Since the project is a </w:t>
+      </w:r>
+      <w:r>
+        <w:t>web-based</w:t>
+      </w:r>
+      <w:r>
+        <w:t xml:space="preserve"> financial system, PHP is </w:t>
+      </w:r>
+      <w:r>
+        <w:t>well-suited</w:t>
+      </w:r>
+      <w:r>
+        <w:t xml:space="preserve"> for managing the server-side logic</w:t>
       </w:r>
       <w:r>
         <w:t xml:space="preserve">. PHP also has native support for MySQL through secure </w:t>
@@ -58,38 +73,81 @@
         <w:t xml:space="preserve"> PHP also </w:t>
       </w:r>
       <w:r>
-        <w:t xml:space="preserve">built in security features, </w:t>
+        <w:t>has built-in</w:t>
+      </w:r>
+      <w:r>
+        <w:t xml:space="preserve"> security features, </w:t>
       </w:r>
       <w:r>
         <w:t>such as</w:t>
       </w:r>
       <w:r>
-        <w:t xml:space="preserve"> session management, password hashing, input validation and secure database communication through prepared statements. While other technologies such as Python along Flask could have been used, I believe that for the scope of this project, PHP offers enough performance and maintainability without </w:t>
+        <w:t xml:space="preserve"> session management, password hashing, input validation and secure database communication through prepared statements. While other technologies</w:t>
+      </w:r>
+      <w:r>
+        <w:t>,</w:t>
+      </w:r>
+      <w:r>
+        <w:t xml:space="preserve"> such as Python </w:t>
+      </w:r>
+      <w:r>
+        <w:t>and</w:t>
+      </w:r>
+      <w:r>
+        <w:t xml:space="preserve"> Flask</w:t>
+      </w:r>
+      <w:r>
+        <w:t>,</w:t>
+      </w:r>
+      <w:r>
+        <w:t xml:space="preserve"> could have been used, I believe that for the scope of this project, PHP offers enough performance and maintainability without </w:t>
       </w:r>
       <w:r>
         <w:t>unnecessary architectural complexity</w:t>
       </w:r>
       <w:r>
         <w:t>.</w:t>
+      </w:r>
+      <w:r>
+        <w:t xml:space="preserve"> I initially considered using other technologies like Node.js and stripe, but I was not sure I could finish the project in time, since the tools require more configuration. </w:t>
       </w:r>
     </w:p>
     <w:p>
       <w:r>
-        <w:t>As for the DBSM I picked MySQL. Since the application will be storing structured data with relationships, a relational database system is necessary.</w:t>
-      </w:r>
-      <w:r>
-        <w:t xml:space="preserve"> MySQL allows the use of primary keys and foreign keys to enforce referential integrity across the tables. Unique constraints and not null constraints help prevent data duplication and maintain consistency between related records, which is important when managing account balance and transaction histories. MySQL is optimised for web applications and performs efficiently for small to medium </w:t>
-      </w:r>
-      <w:proofErr w:type="spellStart"/>
-      <w:r>
-        <w:t>scalesystems</w:t>
-      </w:r>
-      <w:proofErr w:type="spellEnd"/>
-      <w:r>
-        <w:t xml:space="preserve">. Compared to NoSQL databases such as MongoDB, which are schema flexible but less suited for strict relational integrity, MySQL is more appropriate for managing structured financial data. Although more advanced systems such as PostgreSQL, offer additional </w:t>
-      </w:r>
-      <w:r>
-        <w:t>features, MySQL provides enough functionalities for the project, while also being easy to set up and integrate with PHP.</w:t>
+        <w:t>As for the DBSM</w:t>
+      </w:r>
+      <w:r>
+        <w:t>,</w:t>
+      </w:r>
+      <w:r>
+        <w:t xml:space="preserve"> I picked MySQL. Since the application will be storing structured data with relationships, a relational database system is necessary.</w:t>
+      </w:r>
+      <w:r>
+        <w:t xml:space="preserve"> MySQL allows the use of primary keys and foreign keys to enforce referential integrity across the tables. Unique constraints and not null constraints help prevent data duplication and maintain consistency between related records, which is important when managing account </w:t>
+      </w:r>
+      <w:r>
+        <w:t>balances</w:t>
+      </w:r>
+      <w:r>
+        <w:t xml:space="preserve"> and transaction histories. MySQL is optimised for web applications and performs efficiently for small to </w:t>
+      </w:r>
+      <w:r>
+        <w:t>medium-scale systems</w:t>
+      </w:r>
+      <w:r>
+        <w:t xml:space="preserve">. </w:t>
+      </w:r>
+      <w:r>
+        <w:t>Although NoSQL databases such as MongoDB offer flexibility in schema design, they are less suitable for financial applications where strict relational integrity between users and transactions is required</w:t>
+      </w:r>
+      <w:r>
+        <w:t xml:space="preserve">. </w:t>
+      </w:r>
+      <w:r>
+        <w:t xml:space="preserve">The other alternative was PostgreSQL which offers </w:t>
+      </w:r>
+      <w:r>
+        <w:t>more advanced SQL functionality, stronger data integrity enforcement, and better support for complex data types and concurrent transactions compared to MySQL. However, MySQL is generally simpler to configure and more commonly used in lightweight web applications, making it more suitable for smaller-scale projects like this one</w:t>
       </w:r>
     </w:p>
     <w:p>
@@ -108,26 +166,13 @@
         <w:t>make a brick breaker game</w:t>
       </w:r>
       <w:r>
-        <w:t xml:space="preserve"> with </w:t>
-      </w:r>
-      <w:proofErr w:type="spellStart"/>
-      <w:r>
-        <w:t>pygame</w:t>
-      </w:r>
-      <w:proofErr w:type="spellEnd"/>
+        <w:t xml:space="preserve"> with pygame</w:t>
+      </w:r>
       <w:r>
         <w:t xml:space="preserve">, </w:t>
       </w:r>
       <w:r>
-        <w:t xml:space="preserve">but as I went on with the </w:t>
-      </w:r>
-      <w:proofErr w:type="gramStart"/>
-      <w:r>
-        <w:t>project</w:t>
-      </w:r>
-      <w:proofErr w:type="gramEnd"/>
-      <w:r>
-        <w:t xml:space="preserve"> </w:t>
+        <w:t xml:space="preserve">but as I went on with the project </w:t>
       </w:r>
       <w:r>
         <w:t xml:space="preserve">I realised that </w:t>
@@ -237,15 +282,7 @@
     </w:p>
     <w:p>
       <w:r>
-        <w:t xml:space="preserve">So </w:t>
-      </w:r>
-      <w:proofErr w:type="gramStart"/>
-      <w:r>
-        <w:t>instead</w:t>
-      </w:r>
-      <w:proofErr w:type="gramEnd"/>
-      <w:r>
-        <w:t xml:space="preserve"> I decided to switch to </w:t>
+        <w:t xml:space="preserve">So instead I decided to switch to </w:t>
       </w:r>
       <w:r>
         <w:t>a mock-up of a money transfer app, this project requires me to work both in front-end and back-end,</w:t>
@@ -289,795 +326,114 @@
     </w:p>
     <w:p>
       <w:r>
-        <w:t xml:space="preserve">I used PDO as the database API, </w:t>
-      </w:r>
-      <w:r>
-        <w:t xml:space="preserve">with </w:t>
-      </w:r>
-      <w:r>
-        <w:t xml:space="preserve">it </w:t>
-      </w:r>
-      <w:r>
-        <w:t>I can make prepared statements, handle exceptions and validate user inputs.</w:t>
-      </w:r>
-      <w:r>
-        <w:t xml:space="preserve"> Prepared statements </w:t>
-      </w:r>
-      <w:r>
-        <w:t xml:space="preserve">prevent SQL injections by separating the </w:t>
-      </w:r>
-      <w:r>
-        <w:t>SQL</w:t>
+        <w:t xml:space="preserve">The application was designed with usability and data protection as priority because of it’s nature. To have access to all the functionalities the user must login, they need to create an account if they don’t have one. </w:t>
+      </w:r>
+      <w:r>
+        <w:t>To make an account the user is required to give the usual personal info: email, name, address, date of birth. To fully comply with the regulations the app should ask the user to show their passport or another form of identification, however this is demo application</w:t>
+      </w:r>
+      <w:r>
+        <w:t>,</w:t>
+      </w:r>
+      <w:r>
+        <w:t xml:space="preserve"> so this feature was not implemented. The users’ accounts are stored in a table where the password is hashed for security reasons</w:t>
+      </w:r>
+      <w:r>
+        <w:t>. Some</w:t>
+      </w:r>
+      <w:r>
+        <w:t xml:space="preserve"> of the personal details stored are not used at all in the application such as the date of birth </w:t>
+      </w:r>
+      <w:r>
+        <w:t xml:space="preserve">and address, so I would be breaking GDPR’s rules by storing data that I do not use, but I am attempting to follow methods other banking system are using. </w:t>
+      </w:r>
+      <w:r>
+        <w:t>Session-based</w:t>
+      </w:r>
+      <w:r>
+        <w:t xml:space="preserve"> authentication is used throughout the application. Authorisation is granted after the login, and it will stay valid until the user logs out or the session expires</w:t>
+      </w:r>
+      <w:r>
+        <w:t xml:space="preserve">. </w:t>
+      </w:r>
+      <w:r>
+        <w:t>Session timeouts are implemented to reduce the risk of unauthorised access, supporting the “integrity and confidentiality” principle of the UK GDPR</w:t>
+      </w:r>
+      <w:r>
+        <w:t>. The user can manage their expenses on the wallets</w:t>
+      </w:r>
+      <w:r>
+        <w:t>.</w:t>
       </w:r>
       <w:r>
         <w:t xml:space="preserve"> </w:t>
       </w:r>
       <w:r>
-        <w:t xml:space="preserve">query and </w:t>
-      </w:r>
-      <w:r>
-        <w:t>the data submitted by the user</w:t>
-      </w:r>
-      <w:r>
-        <w:t>. The</w:t>
-      </w:r>
-      <w:r>
-        <w:t xml:space="preserve"> program will </w:t>
-      </w:r>
-      <w:r>
-        <w:t xml:space="preserve">first send a SQL query with placeholder </w:t>
-      </w:r>
-      <w:r>
-        <w:t xml:space="preserve">parameters. The data provided by the user will </w:t>
-      </w:r>
-      <w:r>
-        <w:t>then be</w:t>
-      </w:r>
-      <w:r>
-        <w:t xml:space="preserve"> sent separately</w:t>
-      </w:r>
-      <w:r>
-        <w:t>;</w:t>
-      </w:r>
-      <w:r>
-        <w:t xml:space="preserve"> this data will</w:t>
-      </w:r>
-      <w:r>
-        <w:t xml:space="preserve"> be bound to the placeholders and will be treated as </w:t>
-      </w:r>
-      <w:r>
-        <w:t xml:space="preserve">data rather than executable </w:t>
-      </w:r>
-      <w:r>
-        <w:t>code.</w:t>
+        <w:t>W</w:t>
+      </w:r>
+      <w:r>
+        <w:t>hile there are not regulator</w:t>
+      </w:r>
+      <w:r>
+        <w:t>y</w:t>
+      </w:r>
+      <w:r>
+        <w:t xml:space="preserve"> limits on how many wallets a user can have, I set the maximum amount to 8</w:t>
+      </w:r>
+      <w:r>
+        <w:t xml:space="preserve">. This limit was added to reduce complexity  and to simulate fraud prevention constraints. </w:t>
+      </w:r>
+      <w:r>
+        <w:t>A multi-wallet system was implemented to allow users to better track and manage their budgets by separating funds into different wallets, each labelled for a specific purpose such as savings, bills, groceries, or business expenses. This design was inspired by Monzo’s “Pots” feature, which provides similar functionality.</w:t>
+      </w:r>
+      <w:r>
+        <w:t xml:space="preserve"> In addition, there is a wallet designated as default, usually it is the first wallet the user has ever created, but it can be changed when the user opens more. </w:t>
+      </w:r>
+      <w:r>
+        <w:t>This does not differ functionally from other wallets in terms of structure; however, it is used as the primary destination for incoming transfers.</w:t>
+      </w:r>
+      <w:r>
+        <w:t xml:space="preserve"> This was done to simplify the process of sending money to someone without having to ask for too much information of their account. Subsequently, the user can transfer the money received to the wallet of their choice. Although this may be a worse UX for users who would prefer to receive money on one specific account. </w:t>
+      </w:r>
+      <w:r>
+        <w:t>Regarding the transfer between users, the user is required to give the correct username of the receiver and amount they want to send. Usernames where used instead of emails for confidentiality and they look more user friendly. Additionally names and surname were not used because usernames in this application are unique, meaning that only one person can ever have a certain username. The program currently does not have this, but it should display the profile of the receiver to user, it should show the name and surname aswell so the user is can confirm they are sending money to the right person. In the backend</w:t>
+      </w:r>
+      <w:r>
+        <w:t>,</w:t>
+      </w:r>
+      <w:r>
+        <w:t xml:space="preserve"> the wallets balance is changed by just updating the values in the balance column of the wallets table. The balance is stored as decimals and not floats</w:t>
+      </w:r>
+      <w:r>
+        <w:t xml:space="preserve"> numbers</w:t>
+      </w:r>
+      <w:r>
+        <w:t xml:space="preserve">, </w:t>
+      </w:r>
+      <w:r>
+        <w:t>as floating-point arithmetic can introduce precision errors, leading to inconsistencies in financial calculations</w:t>
+      </w:r>
+      <w:r>
+        <w:t xml:space="preserve">. When a transaction happens, money is deducted from the sender’s wallet and the same amount is added to the receiver’s wallet, this follows the double-entry </w:t>
+      </w:r>
+      <w:r>
+        <w:t xml:space="preserve">bookkeeping system to keep data consistency. At the end the transaction is recorded in the table, the date when it happened, the parties involved and amount transferred is all stored. This done so the user can look on their activity history, and also </w:t>
+      </w:r>
+      <w:r>
+        <w:t>because all transactions must be traceable by law, as they can be used to detect money laundering, fraud or support investigation.</w:t>
       </w:r>
       <w:r>
         <w:t xml:space="preserve"> </w:t>
       </w:r>
       <w:r>
-        <w:t>I</w:t>
-      </w:r>
-      <w:r>
-        <w:t xml:space="preserve">f the user were to insert malicious code in the </w:t>
-      </w:r>
-      <w:r>
-        <w:t xml:space="preserve">form’s fields, the </w:t>
-      </w:r>
-      <w:r>
-        <w:t>program would not run the malicious code</w:t>
-      </w:r>
-      <w:r>
-        <w:t>; instead,</w:t>
-      </w:r>
-      <w:r>
         <w:t xml:space="preserve"> </w:t>
-      </w:r>
-      <w:r>
-        <w:t xml:space="preserve">the malicious code would be treated as </w:t>
-      </w:r>
-      <w:r>
-        <w:t>plain</w:t>
-      </w:r>
-      <w:r>
-        <w:t xml:space="preserve"> </w:t>
-      </w:r>
-      <w:r>
-        <w:t>text.</w:t>
-      </w:r>
-      <w:r>
-        <w:t xml:space="preserve"> </w:t>
-      </w:r>
-      <w:r>
-        <w:t xml:space="preserve">I could have used MYSQLI instead since </w:t>
-      </w:r>
-      <w:r>
-        <w:t>it has</w:t>
-      </w:r>
-      <w:r>
-        <w:t xml:space="preserve"> the same security features, but it does not have portability</w:t>
-      </w:r>
-      <w:r>
-        <w:t>,</w:t>
-      </w:r>
-      <w:r>
-        <w:t xml:space="preserve"> unlike PDO.</w:t>
-      </w:r>
-      <w:r>
-        <w:t xml:space="preserve"> PDO </w:t>
-      </w:r>
-      <w:r>
-        <w:t xml:space="preserve">works </w:t>
-      </w:r>
-      <w:r>
-        <w:t>independently</w:t>
-      </w:r>
-      <w:r>
-        <w:t xml:space="preserve"> regardless of the</w:t>
-      </w:r>
-      <w:r>
-        <w:t xml:space="preserve"> database system I choose,</w:t>
-      </w:r>
-      <w:r>
-        <w:t xml:space="preserve"> </w:t>
-      </w:r>
-      <w:r>
-        <w:t>so if</w:t>
-      </w:r>
-      <w:r>
-        <w:t xml:space="preserve"> I </w:t>
-      </w:r>
-      <w:r>
-        <w:t>decide</w:t>
-      </w:r>
-      <w:r>
-        <w:t xml:space="preserve"> to</w:t>
-      </w:r>
-      <w:r>
-        <w:t xml:space="preserve"> switch to</w:t>
-      </w:r>
-      <w:r>
-        <w:t xml:space="preserve"> a different system than MYSQL, I </w:t>
-      </w:r>
-      <w:proofErr w:type="gramStart"/>
-      <w:r>
-        <w:t>would</w:t>
-      </w:r>
-      <w:proofErr w:type="gramEnd"/>
-      <w:r>
-        <w:t xml:space="preserve"> need </w:t>
-      </w:r>
-      <w:r>
-        <w:t xml:space="preserve">to </w:t>
-      </w:r>
-      <w:r>
-        <w:t xml:space="preserve">change only </w:t>
-      </w:r>
-      <w:r>
-        <w:t xml:space="preserve">a </w:t>
-      </w:r>
-      <w:r>
-        <w:t xml:space="preserve">few lines of </w:t>
-      </w:r>
-      <w:r>
-        <w:t>code</w:t>
-      </w:r>
-      <w:r>
-        <w:t xml:space="preserve">. With </w:t>
-      </w:r>
-      <w:r>
-        <w:t>MySQL</w:t>
-      </w:r>
-      <w:r>
-        <w:t>,</w:t>
-      </w:r>
-      <w:r>
-        <w:t xml:space="preserve"> I would have more work to do since it works </w:t>
-      </w:r>
-      <w:r>
-        <w:t>with MYSQL.</w:t>
       </w:r>
     </w:p>
     <w:p>
       <w:r>
-        <w:t xml:space="preserve">I used sessions </w:t>
-      </w:r>
-      <w:r>
-        <w:t>for this web-application</w:t>
-      </w:r>
-      <w:r>
-        <w:t xml:space="preserve">. Session variables </w:t>
-      </w:r>
-      <w:proofErr w:type="gramStart"/>
-      <w:r>
-        <w:t>are were</w:t>
-      </w:r>
-      <w:proofErr w:type="gramEnd"/>
-      <w:r>
-        <w:t xml:space="preserve"> mostly used to maintain user authentication ac</w:t>
-      </w:r>
-      <w:r>
-        <w:t xml:space="preserve">ross the pages. </w:t>
-      </w:r>
-      <w:r>
-        <w:t>After the login, the user’s ID is stored in a session variable, and it is used to access other protec</w:t>
-      </w:r>
-      <w:r>
-        <w:t>ted features of the applications, such as the user’s wallets. This prevents the user from accessing other res</w:t>
-      </w:r>
-      <w:r>
-        <w:t>ources they are not meant to see, through URL manipulation</w:t>
-      </w:r>
-    </w:p>
-    <w:p>
-      <w:r>
-        <w:t xml:space="preserve">The first </w:t>
-      </w:r>
-      <w:r>
-        <w:t>web form</w:t>
-      </w:r>
-      <w:r>
-        <w:t xml:space="preserve"> that </w:t>
-      </w:r>
-      <w:r>
-        <w:t xml:space="preserve">a user will have to submit is the </w:t>
-      </w:r>
-      <w:r>
-        <w:t>sign-up</w:t>
-      </w:r>
-      <w:r>
-        <w:t xml:space="preserve"> for</w:t>
-      </w:r>
-      <w:r>
-        <w:t xml:space="preserve">m. I gave the required attribute to all the </w:t>
-      </w:r>
-      <w:r>
-        <w:t>fields'</w:t>
-      </w:r>
-      <w:r>
-        <w:t xml:space="preserve"> input</w:t>
-      </w:r>
-      <w:r>
-        <w:t xml:space="preserve"> that </w:t>
-      </w:r>
-      <w:r>
-        <w:t xml:space="preserve">I deemed </w:t>
-      </w:r>
-      <w:proofErr w:type="gramStart"/>
-      <w:r>
-        <w:t>necessary</w:t>
-      </w:r>
-      <w:r>
-        <w:t xml:space="preserve">, </w:t>
-      </w:r>
-      <w:r>
-        <w:t xml:space="preserve"> </w:t>
-      </w:r>
-      <w:r>
-        <w:t>furthermore</w:t>
-      </w:r>
-      <w:proofErr w:type="gramEnd"/>
-      <w:r>
-        <w:t xml:space="preserve"> </w:t>
-      </w:r>
-      <w:r>
-        <w:t xml:space="preserve">I gave a pattern attribute to the password field, to prevent the user from </w:t>
-      </w:r>
-      <w:r>
-        <w:t>having a weak password.</w:t>
-      </w:r>
-      <w:r>
-        <w:t xml:space="preserve"> Setting the form inputs as required is not enough, s</w:t>
-      </w:r>
-      <w:r>
-        <w:t xml:space="preserve">ince the user could inspect the page </w:t>
-      </w:r>
-      <w:r>
-        <w:t>and</w:t>
-      </w:r>
-      <w:r>
-        <w:t xml:space="preserve"> change the attributes and the type of the input fields and insert anything they want. </w:t>
-      </w:r>
-      <w:r>
-        <w:t xml:space="preserve">I added form validation in </w:t>
-      </w:r>
-      <w:r>
-        <w:t>the PHP script</w:t>
-      </w:r>
-      <w:r>
-        <w:t xml:space="preserve"> </w:t>
-      </w:r>
-      <w:r>
-        <w:t xml:space="preserve">as well. </w:t>
-      </w:r>
-      <w:r>
-        <w:t xml:space="preserve">To display the error messages, I set a </w:t>
-      </w:r>
-      <w:r>
-        <w:t xml:space="preserve">$_SESSION[‘error’] variable, </w:t>
-      </w:r>
-      <w:r>
-        <w:t xml:space="preserve">this will store a string that describes </w:t>
-      </w:r>
-      <w:r>
-        <w:t>an</w:t>
-      </w:r>
-      <w:r>
-        <w:t xml:space="preserve"> error message </w:t>
-      </w:r>
-      <w:r>
-        <w:t xml:space="preserve">and </w:t>
-      </w:r>
-      <w:r>
-        <w:t>displays</w:t>
-      </w:r>
-      <w:r>
-        <w:t xml:space="preserve"> it when the user triggers it by not </w:t>
-      </w:r>
-      <w:r>
-        <w:t>properly filling the fields</w:t>
+        <w:t>The user can also change some their profile details. The user can not edit their legal name and suname, since they are required to show legal documents. The password of the account be changed, the user only needs to know their current password and submit it to be allowed to create a new one. The program lacks a 2 step authentication system with the email, so it’s not as secure as it should be</w:t>
       </w:r>
       <w:r>
         <w:t>.</w:t>
-      </w:r>
-      <w:r>
-        <w:t xml:space="preserve"> I use this method across the entire up. Before</w:t>
-      </w:r>
-      <w:r>
-        <w:t>,</w:t>
-      </w:r>
-      <w:r>
-        <w:t xml:space="preserve"> I used to</w:t>
-      </w:r>
-      <w:r>
-        <w:t xml:space="preserve"> display error messages by using $_GET variables, but I had to change it since this </w:t>
-      </w:r>
-      <w:r>
-        <w:t xml:space="preserve">exposes the error in the </w:t>
-      </w:r>
-      <w:r>
-        <w:t>URL,</w:t>
-      </w:r>
-      <w:r>
-        <w:t xml:space="preserve"> and the user could exploit</w:t>
-      </w:r>
-      <w:r>
-        <w:t xml:space="preserve"> this</w:t>
-      </w:r>
-      <w:r>
-        <w:t xml:space="preserve">. </w:t>
-      </w:r>
-      <w:r>
-        <w:t xml:space="preserve"> </w:t>
-      </w:r>
-      <w:r>
-        <w:t>After account creation, user data is stored in a relational database consisting of three tables. The users table stores user profile information, the accounts table stores wallet data, and the transactions table records all transfer activity. Each user may have multiple wallets, creating a one-to-many relationship between users and accounts.</w:t>
-      </w:r>
-      <w:r>
-        <w:t xml:space="preserve"> </w:t>
-      </w:r>
-      <w:r>
-        <w:t>Real-world</w:t>
-      </w:r>
-      <w:r>
-        <w:t xml:space="preserve"> cash transfer applications also have </w:t>
-      </w:r>
-      <w:r>
-        <w:t>data warehouses on top of the regular database</w:t>
-      </w:r>
-      <w:r>
-        <w:t>.</w:t>
-      </w:r>
-      <w:r>
-        <w:t xml:space="preserve"> </w:t>
-      </w:r>
-      <w:r>
-        <w:t>Data warehouses are used to store large amounts of data, but they are not used to query day-to-day transactions; instead, they are used for analysing customer behaviour</w:t>
-      </w:r>
-      <w:r>
-        <w:t xml:space="preserve">, fraud detection, </w:t>
-      </w:r>
-      <w:r>
-        <w:t>financial planning and audit reporting</w:t>
-      </w:r>
-      <w:r>
-        <w:t xml:space="preserve">. These analytical capabilities will assist the organisation </w:t>
-      </w:r>
-      <w:r>
-        <w:t xml:space="preserve">in meeting regulatory requirements, such </w:t>
-      </w:r>
-      <w:r>
-        <w:t xml:space="preserve">as the data protection law </w:t>
-      </w:r>
-      <w:r>
-        <w:t>made by</w:t>
-      </w:r>
-      <w:r>
-        <w:t xml:space="preserve"> GDPR</w:t>
-      </w:r>
-      <w:r>
-        <w:t>.</w:t>
-      </w:r>
-      <w:r>
-        <w:t xml:space="preserve"> A data warehouse will not be implemented in my project, since </w:t>
-      </w:r>
-      <w:r>
-        <w:t>this</w:t>
-      </w:r>
-      <w:r>
-        <w:t xml:space="preserve"> is </w:t>
-      </w:r>
-      <w:r>
-        <w:t xml:space="preserve">a </w:t>
-      </w:r>
-      <w:r>
-        <w:t>demo</w:t>
-      </w:r>
-      <w:r>
-        <w:t>, a limited amount of non-real data will be stored</w:t>
-      </w:r>
-      <w:r>
-        <w:t>.</w:t>
-      </w:r>
-    </w:p>
-    <w:p>
-      <w:r>
-        <w:t xml:space="preserve">To </w:t>
-      </w:r>
-      <w:r>
-        <w:t>log in,</w:t>
-      </w:r>
-      <w:r>
-        <w:t xml:space="preserve"> the program will check the user’s email and try to match it </w:t>
-      </w:r>
-      <w:r>
-        <w:t xml:space="preserve">with the password in the database, if correct the user will have access to </w:t>
-      </w:r>
-      <w:r>
-        <w:t>their profile</w:t>
-      </w:r>
-      <w:r>
-        <w:t>.</w:t>
-      </w:r>
-      <w:r>
-        <w:t xml:space="preserve"> </w:t>
-      </w:r>
-      <w:r>
-        <w:t>Here</w:t>
-      </w:r>
-      <w:r>
-        <w:t>,</w:t>
-      </w:r>
-      <w:r>
-        <w:t xml:space="preserve"> the </w:t>
-      </w:r>
-      <w:r>
-        <w:t>user can send money to other users, transfer between wallets,</w:t>
-      </w:r>
-      <w:r>
-        <w:t xml:space="preserve"> change profile details and more. </w:t>
-      </w:r>
-      <w:r>
-        <w:t xml:space="preserve">When the user wants to access one of </w:t>
-      </w:r>
-      <w:r>
-        <w:t xml:space="preserve">his wallets, they </w:t>
-      </w:r>
-      <w:r>
-        <w:t>must</w:t>
-      </w:r>
-      <w:r>
-        <w:t xml:space="preserve"> </w:t>
-      </w:r>
-      <w:r>
-        <w:t xml:space="preserve">use hyperlinks </w:t>
-      </w:r>
-      <w:r>
-        <w:t xml:space="preserve">that </w:t>
-      </w:r>
-      <w:r>
-        <w:t>use</w:t>
-      </w:r>
-      <w:r>
-        <w:t xml:space="preserve"> the wallet</w:t>
-      </w:r>
-      <w:r>
-        <w:t xml:space="preserve"> ID as </w:t>
-      </w:r>
-      <w:r>
-        <w:t xml:space="preserve">a </w:t>
-      </w:r>
-      <w:r>
-        <w:t>parameter</w:t>
-      </w:r>
-      <w:r>
-        <w:t>.</w:t>
-      </w:r>
-      <w:r>
-        <w:t xml:space="preserve"> Hyperlinks use GET methods</w:t>
-      </w:r>
-      <w:r>
-        <w:t>,</w:t>
-      </w:r>
-      <w:r>
-        <w:t xml:space="preserve"> </w:t>
-      </w:r>
-      <w:r>
-        <w:t>which</w:t>
-      </w:r>
-      <w:r>
-        <w:t xml:space="preserve"> poses potential risks since it</w:t>
-      </w:r>
-      <w:r>
-        <w:t xml:space="preserve"> </w:t>
-      </w:r>
-      <w:r>
-        <w:t>displays</w:t>
-      </w:r>
-      <w:r>
-        <w:t xml:space="preserve"> the wallet ID in the </w:t>
-      </w:r>
-      <w:r>
-        <w:t>URL</w:t>
-      </w:r>
-      <w:r>
-        <w:t xml:space="preserve">, </w:t>
-      </w:r>
-      <w:r>
-        <w:t xml:space="preserve">with it the user could try </w:t>
-      </w:r>
-      <w:r>
-        <w:t xml:space="preserve">to </w:t>
-      </w:r>
-      <w:r>
-        <w:t xml:space="preserve">manipulate the </w:t>
-      </w:r>
-      <w:proofErr w:type="spellStart"/>
-      <w:r>
-        <w:t>url</w:t>
-      </w:r>
-      <w:proofErr w:type="spellEnd"/>
-      <w:r>
-        <w:t xml:space="preserve"> and have access to someone else’s wallet</w:t>
-      </w:r>
-      <w:r>
-        <w:t>. To mitigate this risk</w:t>
-      </w:r>
-      <w:r>
-        <w:t>,</w:t>
-      </w:r>
-      <w:r>
-        <w:t xml:space="preserve"> </w:t>
-      </w:r>
-      <w:r>
-        <w:t xml:space="preserve">I put </w:t>
-      </w:r>
-      <w:r>
-        <w:t xml:space="preserve">a </w:t>
-      </w:r>
-      <w:r>
-        <w:t xml:space="preserve">server-side check that will verify if the wallet is owned by the user logged in. </w:t>
-      </w:r>
-      <w:r>
-        <w:t xml:space="preserve">The program </w:t>
-      </w:r>
-      <w:r>
-        <w:t xml:space="preserve">selects the </w:t>
-      </w:r>
-      <w:proofErr w:type="spellStart"/>
-      <w:r>
-        <w:t>walletID</w:t>
-      </w:r>
-      <w:proofErr w:type="spellEnd"/>
-      <w:r>
-        <w:t xml:space="preserve"> in the </w:t>
-      </w:r>
-      <w:r>
-        <w:t>URL</w:t>
-      </w:r>
-      <w:r>
-        <w:t xml:space="preserve"> from the database, </w:t>
-      </w:r>
-      <w:r>
-        <w:t xml:space="preserve">then it compares the owner id </w:t>
-      </w:r>
-      <w:r>
-        <w:t>with the id of the id of the current user</w:t>
-      </w:r>
-      <w:r>
-        <w:t>,</w:t>
-      </w:r>
-      <w:r>
-        <w:t xml:space="preserve"> which is stored in a session variable</w:t>
-      </w:r>
-      <w:r>
-        <w:t>. If</w:t>
-      </w:r>
-      <w:r>
-        <w:t xml:space="preserve"> the </w:t>
-      </w:r>
-      <w:r>
-        <w:t xml:space="preserve">owner and current user don’t match access to the wallet will be </w:t>
-      </w:r>
-      <w:r>
-        <w:t xml:space="preserve">denied. </w:t>
-      </w:r>
-      <w:r>
-        <w:t xml:space="preserve">To </w:t>
-      </w:r>
-      <w:r>
-        <w:t xml:space="preserve">transfer money between the wallets I had to implement database </w:t>
-      </w:r>
-      <w:r>
-        <w:lastRenderedPageBreak/>
-        <w:t xml:space="preserve">transactions. </w:t>
-      </w:r>
-      <w:r>
-        <w:t xml:space="preserve">The database transactions included all the SQL </w:t>
-      </w:r>
-      <w:r>
-        <w:t>operations required for removing money from one wallet and sending it to another safely</w:t>
-      </w:r>
-      <w:r>
-        <w:t>;</w:t>
-      </w:r>
-      <w:r>
-        <w:t xml:space="preserve"> if one</w:t>
-      </w:r>
-      <w:r>
-        <w:t xml:space="preserve"> of</w:t>
-      </w:r>
-      <w:r>
-        <w:t xml:space="preserve"> the </w:t>
-      </w:r>
-      <w:r>
-        <w:t>operations</w:t>
-      </w:r>
-      <w:r>
-        <w:t xml:space="preserve"> in the transaction failed</w:t>
-      </w:r>
-      <w:r>
-        <w:t>, the entire transfer process would be aborted</w:t>
-      </w:r>
-      <w:r>
-        <w:t xml:space="preserve"> without affecting the user</w:t>
-      </w:r>
-      <w:r>
-        <w:t>s’</w:t>
-      </w:r>
-      <w:r>
-        <w:t xml:space="preserve"> wallet</w:t>
-      </w:r>
-      <w:r>
-        <w:t xml:space="preserve"> </w:t>
-      </w:r>
-      <w:r>
-        <w:t xml:space="preserve">balance. </w:t>
-      </w:r>
-      <w:r>
-        <w:t>This was done to prevent</w:t>
-      </w:r>
-      <w:r>
-        <w:t xml:space="preserve"> data loss</w:t>
-      </w:r>
-      <w:r>
-        <w:t xml:space="preserve"> issues, such as the user </w:t>
-      </w:r>
-      <w:r>
-        <w:t xml:space="preserve">sending money </w:t>
-      </w:r>
-      <w:r>
-        <w:t xml:space="preserve">accidentally </w:t>
-      </w:r>
-      <w:r>
-        <w:t>to</w:t>
-      </w:r>
-      <w:r>
-        <w:t xml:space="preserve"> </w:t>
-      </w:r>
-      <w:r>
-        <w:t>an inexistent receiver</w:t>
-      </w:r>
-      <w:r>
-        <w:t>. Without</w:t>
-      </w:r>
-      <w:r>
-        <w:t xml:space="preserve"> the transaction</w:t>
-      </w:r>
-      <w:r>
-        <w:t>,</w:t>
-      </w:r>
-      <w:r>
-        <w:t xml:space="preserve"> the sender would lose the </w:t>
-      </w:r>
-      <w:r>
-        <w:t>money,</w:t>
-      </w:r>
-      <w:r>
-        <w:t xml:space="preserve"> </w:t>
-      </w:r>
-      <w:r>
-        <w:t>and nobody would receive the money since the recipient does not exist in the database.</w:t>
-      </w:r>
-      <w:r>
-        <w:t xml:space="preserve"> Furthermore</w:t>
-      </w:r>
-      <w:r>
-        <w:t>,</w:t>
-      </w:r>
-      <w:r>
-        <w:t xml:space="preserve"> </w:t>
-      </w:r>
-      <w:r>
-        <w:t>to</w:t>
-      </w:r>
-      <w:r>
-        <w:t xml:space="preserve"> improve the data consistency,</w:t>
-      </w:r>
-      <w:r>
-        <w:t xml:space="preserve"> I used SELECT FOR UPDATE queries</w:t>
-      </w:r>
-      <w:r>
-        <w:t xml:space="preserve"> to lock the current wallet row that </w:t>
-      </w:r>
-      <w:r>
-        <w:t>is being edited. Row locking prevents</w:t>
-      </w:r>
-      <w:r>
-        <w:t xml:space="preserve"> </w:t>
-      </w:r>
-      <w:r>
-        <w:t>concurrent money transfers</w:t>
-      </w:r>
-      <w:r>
-        <w:t xml:space="preserve"> in case 2 </w:t>
-      </w:r>
-      <w:r>
-        <w:t xml:space="preserve">or more </w:t>
-      </w:r>
-      <w:r>
-        <w:t>users happen to send money to the</w:t>
-      </w:r>
-      <w:r>
-        <w:t xml:space="preserve"> recipient at the same time</w:t>
-      </w:r>
-      <w:r>
-        <w:t>.</w:t>
-      </w:r>
-      <w:r>
-        <w:t xml:space="preserve"> </w:t>
-      </w:r>
-      <w:r>
-        <w:t>T</w:t>
-      </w:r>
-      <w:r>
-        <w:t>his en</w:t>
-      </w:r>
-      <w:r>
-        <w:t xml:space="preserve">sures that </w:t>
-      </w:r>
-      <w:r>
-        <w:t>the</w:t>
-      </w:r>
-      <w:r>
-        <w:t xml:space="preserve"> transaction</w:t>
-      </w:r>
-      <w:r>
-        <w:t xml:space="preserve"> queries don’t overwrite each other and </w:t>
-      </w:r>
-      <w:r>
-        <w:t>prevents</w:t>
-      </w:r>
-      <w:r>
-        <w:t xml:space="preserve"> errors such </w:t>
-      </w:r>
-      <w:r>
-        <w:t xml:space="preserve">as </w:t>
-      </w:r>
-      <w:r>
-        <w:t>double-spending</w:t>
-      </w:r>
-      <w:r>
-        <w:t xml:space="preserve"> or incorrect wallet balances.</w:t>
       </w:r>
     </w:p>
     <w:p/>
@@ -1086,6 +442,7 @@
         <w:pStyle w:val="Titolo1"/>
       </w:pPr>
       <w:r>
+        <w:lastRenderedPageBreak/>
         <w:t>References</w:t>
       </w:r>
     </w:p>
@@ -1140,15 +497,7 @@
         <w:t>Concurrency Control in SQL Server</w:t>
       </w:r>
       <w:r>
-        <w:t xml:space="preserve"> (2020) </w:t>
-      </w:r>
-      <w:proofErr w:type="spellStart"/>
-      <w:r>
-        <w:t>SQLServerCentral</w:t>
-      </w:r>
-      <w:proofErr w:type="spellEnd"/>
-      <w:r>
-        <w:t>. [Online] [Accessed on 26th March 2026] https://www.sqlservercentral.com/articles/concurrency-control-in-sql-server.</w:t>
+        <w:t xml:space="preserve"> (2020) SQLServerCentral. [Online] [Accessed on 26th March 2026] https://www.sqlservercentral.com/articles/concurrency-control-in-sql-server.</w:t>
       </w:r>
     </w:p>
     <w:p>
@@ -1163,15 +512,7 @@
         <w:t>SQL Injection Prevention · OWASP Cheat Sheet Series</w:t>
       </w:r>
       <w:r>
-        <w:t xml:space="preserve">. Owasp.org. </w:t>
-      </w:r>
-      <w:proofErr w:type="spellStart"/>
-      <w:r>
-        <w:t>Owasp</w:t>
-      </w:r>
-      <w:proofErr w:type="spellEnd"/>
-      <w:r>
-        <w:t>. [Online] [Accessed on 20th March 2026] https://cheatsheetseries.owasp.org/cheatsheets/SQL_Injection_Prevention_Cheat_Sheet.html.</w:t>
+        <w:t>. Owasp.org. Owasp. [Online] [Accessed on 20th March 2026] https://cheatsheetseries.owasp.org/cheatsheets/SQL_Injection_Prevention_Cheat_Sheet.html.</w:t>
       </w:r>
     </w:p>
     <w:p/>

</xml_diff>

<commit_message>
Change user authentication function
</commit_message>
<xml_diff>
--- a/Artifacts/Cash transfer app report.docx
+++ b/Artifacts/Cash transfer app report.docx
@@ -231,16 +231,7 @@
                                 <w:sz w:val="36"/>
                                 <w:szCs w:val="36"/>
                               </w:rPr>
-                              <w:t>26</w:t>
-                            </w:r>
-                            <w:r>
-                              <w:rPr>
-                                <w:i/>
-                                <w:color w:val="404040" w:themeColor="text1" w:themeTint="BF"/>
-                                <w:sz w:val="36"/>
-                                <w:szCs w:val="36"/>
-                              </w:rPr>
-                              <w:t>/04/2026</w:t>
+                              <w:t>26/04/2026</w:t>
                             </w:r>
                             <w:r>
                               <w:rPr>
@@ -435,16 +426,7 @@
                           <w:sz w:val="36"/>
                           <w:szCs w:val="36"/>
                         </w:rPr>
-                        <w:t>26</w:t>
-                      </w:r>
-                      <w:r>
-                        <w:rPr>
-                          <w:i/>
-                          <w:color w:val="404040" w:themeColor="text1" w:themeTint="BF"/>
-                          <w:sz w:val="36"/>
-                          <w:szCs w:val="36"/>
-                        </w:rPr>
-                        <w:t>/04/2026</w:t>
+                        <w:t>26/04/2026</w:t>
                       </w:r>
                       <w:r>
                         <w:rPr>
@@ -575,7 +557,13 @@
     <w:sdt>
       <w:sdtPr>
         <w:rPr>
+          <w:rFonts w:asciiTheme="minorHAnsi" w:eastAsiaTheme="minorHAnsi" w:hAnsiTheme="minorHAnsi" w:cstheme="minorBidi"/>
+          <w:color w:val="auto"/>
+          <w:kern w:val="2"/>
+          <w:sz w:val="22"/>
+          <w:szCs w:val="22"/>
           <w:lang w:val="en-GB"/>
+          <w14:ligatures w14:val="standardContextual"/>
         </w:rPr>
         <w:id w:val="1066765477"/>
         <w:docPartObj>
@@ -585,14 +573,8 @@
       </w:sdtPr>
       <w:sdtEndPr>
         <w:rPr>
-          <w:rFonts w:asciiTheme="minorHAnsi" w:eastAsiaTheme="minorHAnsi" w:hAnsiTheme="minorHAnsi" w:cstheme="minorBidi"/>
           <w:b/>
           <w:bCs/>
-          <w:color w:val="auto"/>
-          <w:kern w:val="2"/>
-          <w:sz w:val="22"/>
-          <w:szCs w:val="22"/>
-          <w14:ligatures w14:val="standardContextual"/>
         </w:rPr>
       </w:sdtEndPr>
       <w:sdtContent>
@@ -1147,13 +1129,7 @@
         <w:t xml:space="preserve"> </w:t>
       </w:r>
       <w:r>
-        <w:t xml:space="preserve">On the other hand, Node.js uses an asynchronous, non-blocking execution model, which allows it to handle </w:t>
-      </w:r>
-      <w:r>
-        <w:t>many</w:t>
-      </w:r>
-      <w:r>
-        <w:t xml:space="preserve"> concurrent requests efficiently. This makes it suitable for high-traffic applications.</w:t>
+        <w:t>On the other hand, Node.js uses an asynchronous, non-blocking execution model, which allows it to handle many concurrent requests efficiently. This makes it suitable for high-traffic applications.</w:t>
       </w:r>
       <w:r>
         <w:t xml:space="preserve">  NodeJS is more scalable</w:t>
@@ -1218,13 +1194,7 @@
         <w:t>, 2026)</w:t>
       </w:r>
     </w:p>
-    <w:p>
-      <w:pPr>
-        <w:rPr>
-          <w:lang w:val="it-IT"/>
-        </w:rPr>
-      </w:pPr>
-    </w:p>
+    <w:p/>
     <w:p>
       <w:r>
         <w:t>As for the DBSM</w:t>
@@ -1446,10 +1416,7 @@
         <w:t xml:space="preserve"> I decided to switch to </w:t>
       </w:r>
       <w:r>
-        <w:t xml:space="preserve">a demo/prototype of a money transfer app. </w:t>
-      </w:r>
-      <w:r>
-        <w:t xml:space="preserve">The research question I wanted to address with </w:t>
+        <w:t xml:space="preserve">a demo/prototype of a money transfer app. The research question I wanted to address with </w:t>
       </w:r>
       <w:r>
         <w:t>this</w:t>
@@ -1921,93 +1888,286 @@
         <w:t>as floating-point arithmetic can introduce precision errors, leading to inconsistencies in financial calculations</w:t>
       </w:r>
       <w:r>
-        <w:t xml:space="preserve">. When a transaction happens, money is deducted from the sender’s </w:t>
+        <w:t>. When a transaction happens, money is deducted from the sender’s wallet</w:t>
+      </w:r>
+      <w:r>
+        <w:t>,</w:t>
+      </w:r>
+      <w:r>
+        <w:t xml:space="preserve"> and the same amount is added to the receiver’s wallet</w:t>
+      </w:r>
+      <w:r>
+        <w:t>. This</w:t>
+      </w:r>
+      <w:r>
+        <w:t xml:space="preserve"> follows the double-entry </w:t>
+      </w:r>
+      <w:r>
+        <w:t>bookkeeping system to keep data consistency. At the end</w:t>
+      </w:r>
+      <w:r>
+        <w:t>,</w:t>
+      </w:r>
+      <w:r>
+        <w:t xml:space="preserve"> the transaction is recorded in the table, the date when it happened, the parties involved and </w:t>
+      </w:r>
+      <w:r>
+        <w:t xml:space="preserve">the </w:t>
+      </w:r>
+      <w:r>
+        <w:t xml:space="preserve">amount transferred </w:t>
+      </w:r>
+      <w:r>
+        <w:t>are</w:t>
+      </w:r>
+      <w:r>
+        <w:t xml:space="preserve"> all stored. This </w:t>
+      </w:r>
+      <w:r>
+        <w:t xml:space="preserve">is </w:t>
+      </w:r>
+      <w:r>
+        <w:t xml:space="preserve">done so the user can look </w:t>
+      </w:r>
+      <w:r>
+        <w:t>at</w:t>
+      </w:r>
+      <w:r>
+        <w:t xml:space="preserve"> their activity history, </w:t>
+      </w:r>
+      <w:r>
+        <w:t>and</w:t>
+      </w:r>
+      <w:r>
+        <w:t xml:space="preserve"> </w:t>
+      </w:r>
+      <w:r>
+        <w:t>because all transactions must be traceable by law, as they can be used to detect money laundering, fraud or support investigation.</w:t>
+      </w:r>
+      <w:r>
+        <w:t xml:space="preserve"> </w:t>
+      </w:r>
+      <w:r>
+        <w:t xml:space="preserve"> </w:t>
+      </w:r>
+    </w:p>
+    <w:p>
+      <w:r>
+        <w:t xml:space="preserve">The user can also change some </w:t>
+      </w:r>
+      <w:r>
+        <w:t xml:space="preserve">of </w:t>
+      </w:r>
+      <w:r>
+        <w:t xml:space="preserve">their profile details. The user can not edit their legal name and </w:t>
+      </w:r>
+      <w:r>
+        <w:t>surname</w:t>
+      </w:r>
+      <w:r>
+        <w:t xml:space="preserve">, since they are required to show legal documents. The password of the account </w:t>
+      </w:r>
+      <w:r>
+        <w:t>is</w:t>
+      </w:r>
+      <w:r>
+        <w:t xml:space="preserve"> changed</w:t>
+      </w:r>
+      <w:r>
+        <w:t>;</w:t>
+      </w:r>
+      <w:r>
+        <w:t xml:space="preserve"> the user only needs to know their current password and submit it to be allowed to create a new one. The program lacks a </w:t>
+      </w:r>
+      <w:r>
+        <w:t>2-step</w:t>
+      </w:r>
+      <w:r>
+        <w:t xml:space="preserve"> authentication system with email, so it’s not as secure as it should be</w:t>
+      </w:r>
+      <w:r>
+        <w:t>.</w:t>
+      </w:r>
+    </w:p>
+    <w:p>
+      <w:pPr>
+        <w:pStyle w:val="Titolo1"/>
+      </w:pPr>
+      <w:r>
+        <w:t>Security features</w:t>
+      </w:r>
+    </w:p>
+    <w:p>
+      <w:r>
+        <w:t xml:space="preserve">To prevent form requests from other websites, a cross-site request forgery prevention was </w:t>
       </w:r>
       <w:proofErr w:type="gramStart"/>
       <w:r>
-        <w:t>wallet</w:t>
+        <w:t>added(</w:t>
       </w:r>
       <w:proofErr w:type="gramEnd"/>
       <w:r>
-        <w:t xml:space="preserve"> and the same amount is added to the receiver’s wallet</w:t>
-      </w:r>
-      <w:r>
-        <w:t>. This</w:t>
-      </w:r>
-      <w:r>
-        <w:t xml:space="preserve"> follows the double-entry </w:t>
-      </w:r>
-      <w:r>
-        <w:t>bookkeeping system to keep data consistency. At the end</w:t>
-      </w:r>
-      <w:r>
-        <w:t>,</w:t>
-      </w:r>
-      <w:r>
-        <w:t xml:space="preserve"> the transaction is recorded in the table, the date when it happened, the parties involved and </w:t>
+        <w:t xml:space="preserve">CSRF). </w:t>
+      </w:r>
+      <w:r>
+        <w:t>A CSRF attack tricks the user into sending data through a malicious website with a forged form</w:t>
+      </w:r>
+      <w:r>
+        <w:t>;</w:t>
+      </w:r>
+      <w:r>
+        <w:t xml:space="preserve"> the request on the forged </w:t>
+      </w:r>
+      <w:r>
+        <w:t xml:space="preserve">form </w:t>
+      </w:r>
+      <w:r>
+        <w:t xml:space="preserve">will be accepted by the server because the user was still </w:t>
+      </w:r>
+      <w:r>
+        <w:lastRenderedPageBreak/>
+        <w:t xml:space="preserve">authenticated. </w:t>
+      </w:r>
+      <w:r>
+        <w:t xml:space="preserve">This attack usually aims at changing users’ emails, passwords, and other personal data, it can also be used to change the destination of money transfer, the user may want to send money to a friend, but if they somehow send the request through the forged form the destination account will be changed to the hacker’s. Hackers accomplish this through social engineering; they might send an email or a message that contains a link with the malicious </w:t>
+      </w:r>
+      <w:proofErr w:type="gramStart"/>
+      <w:r>
+        <w:t>form, and</w:t>
+      </w:r>
+      <w:proofErr w:type="gramEnd"/>
+      <w:r>
+        <w:t xml:space="preserve"> trick the user into executing it.</w:t>
+      </w:r>
+      <w:r>
+        <w:rPr>
+          <w:rFonts w:ascii="Arial" w:eastAsia="Times New Roman" w:hAnsi="Arial" w:cs="Arial"/>
+          <w:kern w:val="0"/>
+          <w:sz w:val="24"/>
+          <w:szCs w:val="24"/>
+          <w:lang w:eastAsia="en-GB"/>
+          <w14:ligatures w14:val="none"/>
+        </w:rPr>
+        <w:t xml:space="preserve"> </w:t>
+      </w:r>
+      <w:r>
+        <w:t>(KirstenS, 2023)</w:t>
+      </w:r>
+    </w:p>
+    <w:p>
+      <w:r>
+        <w:t>In each form that the user can send to the server, there will be a CSRF token embedded</w:t>
+      </w:r>
+      <w:r>
+        <w:t xml:space="preserve"> and a copy of it will be stored in the session; only the forms from the legitimate website will have this token</w:t>
+      </w:r>
+      <w:r>
+        <w:t>. The token is generated only upon login</w:t>
+      </w:r>
+      <w:r>
+        <w:t>. If</w:t>
+      </w:r>
+      <w:r>
+        <w:t xml:space="preserve"> the user tries to submit a form from a different website or is somehow </w:t>
+      </w:r>
+      <w:r>
+        <w:t>unknowingly coerced</w:t>
+      </w:r>
+      <w:r>
+        <w:t xml:space="preserve"> into doing so, the form request will be rejected </w:t>
+      </w:r>
+      <w:r>
+        <w:t xml:space="preserve">by the server, since the token is missing, the server would not be able to compare </w:t>
+      </w:r>
+      <w:r>
+        <w:t xml:space="preserve">it </w:t>
+      </w:r>
+      <w:r>
+        <w:t xml:space="preserve">with the token stored in the session. </w:t>
+      </w:r>
+    </w:p>
+    <w:p>
+      <w:r>
+        <w:t xml:space="preserve">The other security feature added is the rate limit. In the application, it was implemented only at the login phase. It works by counting the number of attempts the user makes to </w:t>
+      </w:r>
+      <w:r>
+        <w:t>log in</w:t>
+      </w:r>
+      <w:r>
+        <w:t xml:space="preserve">; it increases each time the user inserts </w:t>
       </w:r>
       <w:r>
         <w:t xml:space="preserve">the </w:t>
       </w:r>
       <w:r>
-        <w:t xml:space="preserve">amount transferred is all stored. This </w:t>
-      </w:r>
-      <w:r>
-        <w:t xml:space="preserve">is </w:t>
-      </w:r>
-      <w:r>
-        <w:t xml:space="preserve">done so the user can look </w:t>
-      </w:r>
-      <w:r>
-        <w:t>at</w:t>
-      </w:r>
-      <w:r>
-        <w:t xml:space="preserve"> their activity history, </w:t>
-      </w:r>
-      <w:r>
-        <w:t>and</w:t>
+        <w:t xml:space="preserve">wrong credentials. If the user fails 5 times, their account will be locked for 10 minutes from any attempt, even if they insert the right credentials. It uses the user’s </w:t>
+      </w:r>
+      <w:r>
+        <w:t>IPv4</w:t>
+      </w:r>
+      <w:r>
+        <w:t xml:space="preserve"> address to track </w:t>
+      </w:r>
+      <w:r>
+        <w:t>the number</w:t>
+      </w:r>
+      <w:r>
+        <w:t xml:space="preserve"> of </w:t>
+      </w:r>
+      <w:r>
+        <w:t>times</w:t>
+      </w:r>
+      <w:r>
+        <w:t xml:space="preserve"> the user has tried to </w:t>
+      </w:r>
+      <w:r>
+        <w:t>log in</w:t>
+      </w:r>
+      <w:r>
+        <w:t xml:space="preserve"> and when it happened. The user will be flagged as locked out if the difference between the current time and the time they got locked </w:t>
+      </w:r>
+      <w:r>
+        <w:t>out</w:t>
+      </w:r>
+      <w:r>
+        <w:t xml:space="preserve"> is greater than 10. The number of attempts will be reset when the user is unlocked or if they </w:t>
+      </w:r>
+      <w:r>
+        <w:t>log in</w:t>
+      </w:r>
+      <w:r>
+        <w:t xml:space="preserve"> successfully before being locked. This was done to prevent brute force attacks</w:t>
+      </w:r>
+      <w:r>
+        <w:t xml:space="preserve"> and</w:t>
       </w:r>
       <w:r>
         <w:t xml:space="preserve"> </w:t>
       </w:r>
       <w:r>
-        <w:t>because all transactions must be traceable by law, as they can be used to detect money laundering, fraud or support investigation.</w:t>
-      </w:r>
-      <w:r>
-        <w:t xml:space="preserve"> </w:t>
-      </w:r>
-      <w:r>
-        <w:t xml:space="preserve"> </w:t>
-      </w:r>
-    </w:p>
-    <w:p>
-      <w:r>
-        <w:t xml:space="preserve">The user can also change some </w:t>
-      </w:r>
-      <w:r>
-        <w:t xml:space="preserve">of </w:t>
-      </w:r>
-      <w:r>
-        <w:t xml:space="preserve">their profile details. The user can not edit their legal name and </w:t>
-      </w:r>
-      <w:r>
-        <w:t>surname</w:t>
-      </w:r>
-      <w:r>
-        <w:t xml:space="preserve">, since they are required to show legal documents. The password of the account be changed, the user only needs to know their current password and submit it to be allowed to create a new one. The program lacks a </w:t>
+        <w:t xml:space="preserve">to guess passwords, but this security feature is also useful to reduce the number of requests a </w:t>
       </w:r>
       <w:proofErr w:type="gramStart"/>
       <w:r>
-        <w:t>2 step</w:t>
+        <w:t>user</w:t>
       </w:r>
       <w:proofErr w:type="gramEnd"/>
       <w:r>
-        <w:t xml:space="preserve"> authentication system with email, so it’s not as secure as it should be</w:t>
-      </w:r>
-      <w:r>
-        <w:t>.</w:t>
-      </w:r>
-    </w:p>
+        <w:t xml:space="preserve"> or a bot can send in a small window of time. It can mitigate DoS attacks, which the application is currently vulnerable, because a malicious actor could set a bot that could send a lot of money transfer requests in a short amount of </w:t>
+      </w:r>
+      <w:proofErr w:type="gramStart"/>
+      <w:r>
+        <w:t>time.</w:t>
+      </w:r>
+      <w:r>
+        <w:t>(</w:t>
+      </w:r>
+      <w:proofErr w:type="gramEnd"/>
+      <w:r>
+        <w:t>Cloudflare, 2024)</w:t>
+      </w:r>
+    </w:p>
+    <w:p/>
     <w:p>
       <w:pPr>
         <w:pStyle w:val="Titolo1"/>
@@ -2020,14 +2180,7 @@
     </w:p>
     <w:p>
       <w:r>
-        <w:t xml:space="preserve">The program currently lacks a lot of features that real-world fintech software has. There are a lot of security requirements that are not fulfilled yet. </w:t>
-      </w:r>
-      <w:r>
-        <w:t xml:space="preserve">Some of these plans were abandoned due to time </w:t>
-      </w:r>
-      <w:r>
-        <w:lastRenderedPageBreak/>
-        <w:t xml:space="preserve">constraints, </w:t>
+        <w:t xml:space="preserve">The program currently lacks a lot of features that real-world fintech software has. There are a lot of security requirements that are not fulfilled yet. Some of these plans were abandoned due to time constraints, </w:t>
       </w:r>
       <w:r>
         <w:t>others</w:t>
@@ -2055,19 +2208,14 @@
         <w:t>, so it could update the exchange rates regularly, but due to time constraints, I dropped this feature. The UI was kept very basic, since most of the attention was directed toward the application’s security and other backend functionalities. But I tried to make it easy to navigate and use.</w:t>
       </w:r>
     </w:p>
-    <w:p>
-      <w:pPr>
-        <w:rPr>
-          <w:lang w:val="it-IT"/>
-        </w:rPr>
-      </w:pPr>
-    </w:p>
+    <w:p/>
     <w:p>
       <w:pPr>
         <w:pStyle w:val="Titolo1"/>
       </w:pPr>
       <w:bookmarkStart w:id="4" w:name="_Toc228136903"/>
       <w:r>
+        <w:lastRenderedPageBreak/>
         <w:t>References</w:t>
       </w:r>
       <w:bookmarkEnd w:id="4"/>
@@ -2263,10 +2411,35 @@
         <w:t>OEM tokenisation: How Apple Pay tokenisation works?</w:t>
       </w:r>
       <w:r>
-        <w:t xml:space="preserve"> (2026) www.meawallet.com. [Online] https://www.meawallet.com/en/news/how-apple-pay-tokenisation-works.</w:t>
-      </w:r>
-    </w:p>
-    <w:p/>
+        <w:t xml:space="preserve"> (2026) www.meawallet.com. [Online] </w:t>
+      </w:r>
+      <w:hyperlink r:id="rId12" w:history="1">
+        <w:r>
+          <w:rPr>
+            <w:rStyle w:val="Collegamentoipertestuale"/>
+          </w:rPr>
+          <w:t>https://www.meawallet.com/en/news/how-apple-pay-tokenisation-works</w:t>
+        </w:r>
+      </w:hyperlink>
+      <w:r>
+        <w:t>.</w:t>
+      </w:r>
+    </w:p>
+    <w:p>
+      <w:r>
+        <w:t xml:space="preserve">Cloudflare (2024) </w:t>
+      </w:r>
+      <w:r>
+        <w:rPr>
+          <w:i/>
+          <w:iCs/>
+        </w:rPr>
+        <w:t>What is rate limiting? | Rate limiting and bots</w:t>
+      </w:r>
+      <w:r>
+        <w:t>. Cloudflare.com. [Online] https://www.cloudflare.com/learning/bots/what-is-rate-limiting/.</w:t>
+      </w:r>
+    </w:p>
     <w:p>
       <w:r>
         <w:rPr>
@@ -2288,7 +2461,14 @@
           <w:i/>
           <w:iCs/>
         </w:rPr>
-        <w:t>Cross Site Request Forgery (CSRF) | OWASP</w:t>
+        <w:t>Cross-Site</w:t>
+      </w:r>
+      <w:r>
+        <w:rPr>
+          <w:i/>
+          <w:iCs/>
+        </w:rPr>
+        <w:t xml:space="preserve"> Request Forgery (CSRF) | OWASP</w:t>
       </w:r>
       <w:r>
         <w:t>. owasp.org. [Online] https://owasp.org/www-community/attacks/csrf.</w:t>
@@ -2296,7 +2476,6 @@
     </w:p>
     <w:p>
       <w:r>
-        <w:lastRenderedPageBreak/>
         <w:t xml:space="preserve">Web Dev Cody (2023) </w:t>
       </w:r>
       <w:r>
@@ -2339,7 +2518,7 @@
     </w:p>
     <w:p/>
     <w:sectPr>
-      <w:footerReference w:type="default" r:id="rId12"/>
+      <w:footerReference w:type="default" r:id="rId13"/>
       <w:pgSz w:w="11906" w:h="16838"/>
       <w:pgMar w:top="1440" w:right="1440" w:bottom="1440" w:left="1440" w:header="708" w:footer="708" w:gutter="0"/>
       <w:cols w:space="708"/>

</xml_diff>